<commit_message>
feat: add preview shop and six-hour offline rewards
</commit_message>
<xml_diff>
--- a/AI/planning/beta-20260913/왕국군_키우기_기획서_개정_베타버전.docx
+++ b/AI/planning/beta-20260913/왕국군_키우기_기획서_개정_베타버전.docx
@@ -12,12 +12,12 @@
     </w:p>
     <w:p>
       <w:r>
-        <w:t>2026년 9월 20일 개정   게임 0.13.0</w:t>
+        <w:t>2026년 9월 27일 상점과 재접속 보상 개정</w:t>
       </w:r>
     </w:p>
     <w:p>
       <w:r>
-        <w:t>세 병사의 편성과 성장을 바탕으로 자동 전투를 진행하는 모바일 세로형 방치 RPG의 현재 운영 방향이다. 이번 개정은 무한 스테이지, 장비 포화 문제, 전직별 전투 판정, 마탑 시각 품질과 성장 경로를 정비한다. 환생은 사용자가 선택한 전통적 초기화 방향과 아직 결정되지 않은 영구 보상을 구분한다.</w:t>
+        <w:t>세 병사의 편성과 성장을 바탕으로 자동 전투를 진행하는 모바일 세로형 방치 RPG의 운영 방향이다. 이번 개정은 상점 팝업, 저가 재화·패키지·무기한 광고 제거 구성, 선택형 광고 보상과 최대 6시간의 재접속 보상을 반영한다. 실제 결제·광고·상품 보상 연동과 현재 화면 미리보기의 범위를 구분한다.</w:t>
       </w:r>
     </w:p>
     <w:p>
@@ -117,7 +117,7 @@
     </w:p>
     <w:p>
       <w:r>
-        <w:t>마탑은 슬롯 5개와 서로 다른 스킬 9종을 사용한다. 질풍 칼날 ID 6은 제거하고 재사용하지 않는다. 기존 소유 투자 기록은 보존하며 장착은 해제한다. 같은 스킬을 다른 슬롯에서 고르면 자리 바꾸기 한다. 교체·해제 중에도 진행 중인 시전은 유지하고 슬롯 및 스킬 쿨타임을 보존한다. 유효 대상이 있을 때 자동 시전하며 회복은 생존 아군 HP 90% 미만일 때 시작한다. SO가 런타임 원본이며 Skill_Catalog.xlsx는 개발자 열람용 동기화 문서다.</w:t>
+        <w:t>마탑은 슬롯 5개와 스킬 8종을 사용한다. 활성 ID는 0~5, 7, 9이며 질풍 칼날 ID 6과 독립 운석 낙하 ID 8은 로스터·뽑기·장착·시전에서 제외하고 재사용하지 않는다. 운석은 유성우 ID 3의 개화 메테오로 통합한다. 같은 스킬을 다른 슬롯에서 고르면 자리를 바꾸며 진행 중인 시전·쿨타임은 유지한다. SO가 런타임 원본이고 Skill_Catalog.xlsx는 개발자 동기화 문서다.</w:t>
       </w:r>
     </w:p>
     <w:p>
@@ -155,7 +155,7 @@
     </w:p>
     <w:p>
       <w:r>
-        <w:t>운석 시전 원과 두 장의 지속 불길을 제거하고 본체와 꼬리가 이어진 낙하, 짧은 착탄, 축소된 크레이터로 정리한다. 성역은 불투명 문양의 상승·유지·하강과 넓은 지면 회복 파동을 분리한다. 공허는 기존 형상을 보존한 업스케일을 채택하고 흡인을 피해 반경보다 50% 넓게 한다.</w:t>
+        <w:t>메테오는 유성우의 개화로 통합하며 시전 원을 사용하지 않는다. 1.5초 가속 낙하와 타격, 3.5초 맥동 균열 장판으로 연결한다. 핵심 VFX의 단발 타격은 전투원 전면, 지속 장판은 후면에 표시한다. 공허는 기존 실루엣과 피해 반경보다 50% 넓은 흡인 범위를 유지한다.</w:t>
       </w:r>
     </w:p>
     <w:p>
@@ -183,12 +183,62 @@
     </w:p>
     <w:p>
       <w:r>
-        <w:t>골드는 일시 기초 능력치, 주화는 뽑기, 전직 파편은 직업 해금, 비전 지식은 마탑 강화, 루비는 영구 사냥 수급, 강화석은 장비 강화를 맡는다. 무제한 재화 교환과 루비 자기 생산 강화는 제공하지 않는다.</w:t>
+        <w:t>골드는 일시 기초 능력치, 주화는 뽑기와 상점의 골드 보급, 전직 파편은 직업 해금, 비전 지식은 마탑 강화, 루비는 영구 사냥 수급, 강화석은 장비 강화를 맡는다. 골드 보급은 아래 상점의 고정 비용·시간 규격으로 한정하며 역교환과 루비 자기 생산 강화는 제공하지 않는다. 현재 상점 교환은 미연동 상태다.</w:t>
       </w:r>
     </w:p>
     <w:p>
       <w:r>
         <w:t>루비 비용은 현재 레벨 L에서 ceil(20×1.08^L), 각 트랙 레벨당 획득량 +2%, 상한 50이다. 2-5 최초 완료 후 해금한다. 계정 200에서는 EXP 강화 구매를 막는다. 기존 실제 지출 80% 환급과 하루 1회 초기화 정책은 유지한다.</w:t>
+      </w:r>
+    </w:p>
+    <w:p>
+      <w:pPr>
+        <w:pStyle w:val="Heading1"/>
+      </w:pPr>
+      <w:r>
+        <w:t>상점과 수익화</w:t>
+      </w:r>
+    </w:p>
+    <w:p>
+      <w:pPr/>
+      <w:r>
+        <w:t>햄버거 메뉴의 상점에서 추천·재화·광고 보상 탭이 있는 팝업을 연다. 고대주화는 1,000개/1,000원, 3,300개/3,000원, 5,750개/5,000원, 12,000개/10,000원으로 구성한다. 큰 상품에는 기본 1주화/1원 대비 각각 10%, 15%, 20%를 추가한다.</w:t>
+      </w:r>
+    </w:p>
+    <w:p>
+      <w:pPr/>
+      <w:r>
+        <w:t>작은 보급은 1,500원에 고대주화 1,500개와 장비·마탑 뽑기권 각 10장, 든든한 보급은 3,900원에 고대주화 5,000개와 두 뽑기권 각 20장이다. 패키지 구매 횟수 제한은 이번 범위에 추가하지 않는다. 상세 상품과 고정 ID의 원본은 ShopCatalog.cs다.</w:t>
+      </w:r>
+    </w:p>
+    <w:p>
+      <w:pPr/>
+      <w:r>
+        <w:t>광고 제거는 3,900원 1회 구매의 무기한 상품으로 설계한다. 모든 광고를 제거하고 보상형 광고는 영상 시청 없이 해당 보상을 수령한다. 일일 수령 횟수와 오프라인 추가 지급의 1회 제한은 그대로 유지하며 자동으로 보상을 반복 지급하지 않는다.</w:t>
+      </w:r>
+    </w:p>
+    <w:p>
+      <w:pPr/>
+      <w:r>
+        <w:t>장비 뽑기권과 마탑 뽑기권은 서로 다른 광고 항목이다. 각각 광고 1회로 해당 뽑기권 2장을 하루 1회 받을 수 있게 설계한다. 한 광고로 두 종류 모두를 지급하지 않는다. 기준일은 한국 표준시 00:00에 전환하며 미수령분을 이월하지 않는 서버 정책으로 연동한다. 현재 화면은 횟수를 소모하거나 광고 보상을 지급하지 않는다.</w:t>
+      </w:r>
+    </w:p>
+    <w:p>
+      <w:pPr/>
+      <w:r>
+        <w:t>골드 보급은 고대주화 100개로 기준 수입 30분치, 300개로 120분치를 제공한다. 기준 분당 골드 = 안전 클리어 일반 웨이브의 1체 골드 × min(검증 KPM, 30) × 루비 골드 배율이다. 퀘스트 동적 골드 함수의 2분 보상 값을 2로 나눠 재사용하고 오프라인 효율 60%를 다시 곱하지 않는다. 유효한 안전 웨이브·KPM 표본이 없을 때는 분당 30골드를 사용한다. 최종 표시량은 분당 수입 × 상품 시간의 소수점 이하를 버린 값이다.</w:t>
+      </w:r>
+    </w:p>
+    <w:p>
+      <w:pPr/>
+      <w:r>
+        <w:t>이번 버전의 상점은 화면 미리보기다. 구매·골드 교환·광고 버튼은 준비 중 토스트만 표시하며 결제, 광고 재생, 재화 차감, 보상 지급, 광고 제거 권리 활성화와 일일 횟수 변경은 하지 않는다. 실제 판매 가격은 향후 Google Play 상품 설정과 결제 화면의 현지화 가격을 기준으로 표시한다.</w:t>
+      </w:r>
+    </w:p>
+    <w:p>
+      <w:pPr/>
+      <w:r>
+        <w:t>상점 미리보기 데이터는 실제 지급 서비스와 분리한다. 후속 서버 연동에서 영수증·중복 요청·권리 복원·환불과 광고 보상 원장을 검증한다. 패스·성장 펀드·월정액·시간 연장 등 추가 상품은 현재 범위에 포함하지 않는다.</w:t>
       </w:r>
     </w:p>
     <w:p>
@@ -206,7 +256,13 @@
     </w:p>
     <w:p>
       <w:r>
-        <w:t>오프라인 보상은 안전하게 완료한 일반 웨이브, 최대 8시간·온라인 효율 60%·30킬/분 상한의 골드·EXP다. 보스·던전·무기·주화는 생산하지 않는다. 무한 스테이지도 같은 런타임 보상 계산을 따른다.</w:t>
+        <w:t>오프라인 보상은 안전하게 완료한 일반 웨이브, 최대 6시간·온라인 효율 60%·30킬/분 상한의 골드·EXP다. 최대 가상 처치는 6,480회이며 보스·던전·무기·주화는 생산하지 않는다. 미접속 구간마다 적용하는 상한이며 일일 총량 한도는 아니다. 무한 스테이지도 같은 런타임 보상 계산을 따른다.</w:t>
+      </w:r>
+    </w:p>
+    <w:p>
+      <w:pPr/>
+      <w:r>
+        <w:t>재접속 팝업에 광고 보상 2배 버튼을 제공한다. 기본 보상은 현재 복귀 처리에서 이미 원자적으로 정산되며, 미연동 버튼은 기본 보상이 지급됐다는 토스트만 표시한다. 향후 광고 검증 성공 또는 광고 제거 권리 확인 후 같은 ClaimId의 기본 지급분과 동일한 골드·EXP를 추가로 1회 지급한다. 기본 지급을 다시 수행하거나 단순 클라이언트 버튼 입력만으로 추가 보상을 지급하지 않는다.</w:t>
       </w:r>
     </w:p>
     <w:p>
@@ -255,37 +311,22 @@
         <w:pStyle w:val="Heading1"/>
       </w:pPr>
       <w:r>
-        <w:t>환생 개정의 확정 방향과 미결정 항목</w:t>
+        <w:t>환생과 영구 성장</w:t>
       </w:r>
     </w:p>
     <w:p>
       <w:r>
-        <w:t>전통적 환생 방향은 확정했다. 골드와 골드 공격력·체력 강화를 초기화하고 더 큰 영구 보상을 제공한다. 보상 유형·지급 곡선·해금 시점은 문답 중이며 새 초기화 정책은 아직 실제 저장에 적용하지 않는다. 이하 구 환생 제한·레벨식은 현재 런타임의 이관 전 규격이며 새 설계의 확정 수치가 아니다.</w:t>
+        <w:t>환생 확정 시 기존 보상 정책에 따라 환생 레벨을 min(300−현재 환생 레벨, 5×이번 사이클 최고 보스 클리어 장)만큼 올리고 메인 1-1로 돌아간다. 골드 잔액·골드 소수 잔여와 공격력·체력 골드 강화 레벨, 이번 사이클 보스 기록은 0으로 초기화한다. 이 초기화는 2026년 9월 22일 구현·검증되었다.</w:t>
       </w:r>
     </w:p>
     <w:p>
       <w:r>
-        <w:t>확정 방향은 초기화와 보존을 명확히 나누는 것이다. 초기화 후보는 현재 메인 진행 1-1, 골드 잔액, 골드 ATK·HP 레벨, 이번 사이클 보스 기록, 안전 사냥 기준과 오프라인 측정 구간이다. 환생 직전 오프라인 보상은 먼저 한 번 정산하고 이전 고난도 웨이브의 수입을 새 사이클로 가져오지 않는다.</w:t>
+        <w:t>환생은 이번 사이클 1장 보스 클리어 이후, 사이클 시작 또는 마지막 환생부터 600초 경과, 하루 3회와 환생 레벨 300 상한을 적용한다. 보스·던전 중에는 실행하지 않고 일반 웨이브 경계에 예약한 뒤 원자 저장한다. 저장 실패와 중복 경계 처리는 추가 보상이나 부분 초기화를 만들지 않는다.</w:t>
       </w:r>
     </w:p>
     <w:p>
       <w:r>
-        <w:t>보존안은 계정 레벨·EXP, 전직 해금과 편성, 장비·강화·잠금·장착, 강화석, 주화·루비·비전 지식·전직 파편, 마탑 소유·강화·각성·장착, 루비 영구 성장, 던전 개방, 영구 최초 보상·퀘스트·업적 원장이다. 이는 새 환생 구현 전 최종 확인할 이관안이다.</w:t>
-      </w:r>
-    </w:p>
-    <w:p>
-      <w:r>
-        <w:t>영구 보상 선택지는 환생 정수로 공격력·체력·사냥 특성을 직접 고르는 방식과 환생 레벨에 따라 공격력·체력이 함께 오르는 방식이다. 사용자에게 선택 질문을 전달했으며 답변 전 재화 ID·보상식·메뉴 구매를 확정하지 않는다. 유물 뽑기·과금 보상·광고 보상을 여기에 자동으로 추가하지 않는다.</w:t>
-      </w:r>
-    </w:p>
-    <w:p>
-      <w:r>
-        <w:t>검토용 보상 곡선은 이번 사이클 최고 보스 진척의 제곱근에 비례하는 형태에서 시작한다. 같은 구간을 짧게 반복하는 횟수보다 더 깊이 진행한 선택에 보상한다. 기존 하루 3회·10분·환생 300레벨 상한은 그대로 확정하지 않고, 재도달 시간·첫 환생 체감 배율·하루 보상 편차를 시뮬레이션한 뒤 수치안을 제시한다.</w:t>
-      </w:r>
-    </w:p>
-    <w:p>
-      <w:r>
-        <w:t>구현 전 검증은 초기화 전후 비교 확인창, 하나의 원자 저장, 저장 실패 시 전체 취소, 중복 실행 방지, 오프라인 안전 기준 초기화, 새 사이클 장비 보존, 최초 보상 중복 방지, 기존 환생 투자 이관을 포함한다. 계정별 실제 데이터 초기화는 승인된 정책이 정해진 뒤 진행한다.</w:t>
+        <w:t>계정 레벨·EXP, 전직 해금과 현재 전직, 장비 소유·강화·잠금·장착·추가 보관, 마탑 소유·강화·각성·개화·장착, 루비 성장, 골드 이외 재화, 던전 진척과 최초 클리어·퀘스트·업적 기록을 보존한다. 보스 자동 도전 설정도 유지한다. 현행 환생에서는 오프라인 안전 웨이브·KPM·마지막 활동 시각을 초기화하지 않는다. 새 환생 재화와 별도 제곱근 보상 곡선은 사용하지 않는다.</w:t>
       </w:r>
     </w:p>
     <w:sectPr>

</xml_diff>

<commit_message>
feat(shop): restore preview shop on develop while preserving team systems
Port shop-specific changes from 66724e0e4. Preserve current server, wallet, check-in, mailbox and offline reward implementations; exclude the historical six-hour and offline ad placeholder changes. Unity 6000.3.21f1 import, 16 acceptance checks and 2941 serialized references passed.
</commit_message>
<xml_diff>
--- a/AI/planning/beta-20260913/왕국군_키우기_기획서_개정_베타버전.docx
+++ b/AI/planning/beta-20260913/왕국군_키우기_기획서_개정_베타버전.docx
@@ -189,6 +189,49 @@
     <w:p>
       <w:r>
         <w:t>루비 비용은 현재 레벨 L에서 ceil(20×1.08^L), 각 트랙 레벨당 획득량 +2%, 상한 50이다. 2-5 최초 완료 후 해금한다. 계정 200에서는 EXP 강화 구매를 막는다. 기존 실제 지출 80% 환급과 하루 1회 초기화 정책은 유지한다.</w:t>
+      </w:r>
+    </w:p>
+    <w:p>
+      <w:pPr>
+        <w:pStyle w:val="Heading1"/>
+      </w:pPr>
+      <w:r>
+        <w:t>상점 미리보기</w:t>
+      </w:r>
+    </w:p>
+    <w:p>
+      <w:r>
+        <w:t>햄버거 메뉴의 상점에서 팝업을 열고 추천 3종, 주화와 골드 6종, 매일 광고 2종의 총 11개 상품을 확인한다. 하단 네 탐색 탭은 기존 구성을 유지한다. 상점의 구매·교환·광고 버튼은 준비 중 안내만 표시하며 현재 재화를 지급하거나 소비하지 않는다.</w:t>
+      </w:r>
+    </w:p>
+    <w:p>
+      <w:r>
+        <w:t>추천 상품의 예정 구성은 광고 제거 3,900원, 작은 보급 패키지 1,500원, 든든한 보급 패키지 3,900원이다. 광고 제거는 무기한 이용과 광고 보상의 영상 없는 수령을 표시하되 일일 횟수는 유지하는 안이다. 작은 패키지는 고대주화 1,500개와 장비·마탑 뽑기권 각 10장, 든든한 패키지는 고대주화 5,000개와 각 20장이다. 이 구성으로 실제 이용 권리나 보상을 부여하지 않는다.</w:t>
+      </w:r>
+    </w:p>
+    <w:p>
+      <w:r>
+        <w:t>주화 상품의 예정가는 고대주화 1,000개 1,000원, 3,300개 3,000원, 5,750개 5,000원, 12,000개 10,000원이다. 골드 보급은 30분치에 고대주화 100개, 2시간치에 300개를 표시하는 미리보기다. 실제 판매가는 스토어 연동 후 확인하며 현재 구매나 교환은 실행되지 않는다.</w:t>
+      </w:r>
+    </w:p>
+    <w:p>
+      <w:r>
+        <w:t>골드 미리보기는 기존 동적 퀘스트 골드의 2분 기준값을 2로 나눈 분당 수입에 30분 또는 120분을 곱하고 마지막에 내림한다. 안전 클리어 일반 웨이브, 검증된 킬/분과 현재 루비 골드 효과를 재사용하며 오프라인 효율 60%는 적용하지 않는다. 측정 전에는 기존 퀘스트의 분당 30골드 기준을 사용한다.</w:t>
+      </w:r>
+    </w:p>
+    <w:p>
+      <w:r>
+        <w:t>매일 광고의 예정 구성은 장비 뽑기권 2장과 마탑 뽑기권 2장의 두 독립 상품이다. 각 상품은 하루 1회, 한국 시간 오전 0시 초기화로 표시한다. 현재 상점에서는 광고를 재생하거나 뽑기권을 지급하지 않는다.</w:t>
+      </w:r>
+    </w:p>
+    <w:p>
+      <w:r>
+        <w:t>보유 고대주화는 기존 계정 지갑의 잔액을 읽는다. 유료 구매 원장, IAP 영수증 검증과 지급, 광고 제거 이용 권리, 뽑기권 원장과 일일 상품의 광고 보상 연동은 SDK·서버 담당 구현에 연결할 범위다. 상점 UI가 별도 재화 원장을 만들거나 현재 서버 조회·저장 정책을 변경하지 않는다.</w:t>
+      </w:r>
+    </w:p>
+    <w:p>
+      <w:r>
+        <w:t>오프라인 보상의 최대 8시간과 팀에서 구현한 광고 재생·보상 2배 지급 경로를 유지한다. 상점의 매일 광고 미리보기는 이 기존 경로를 대체하지 않는다. 시즌 패스와 성장 펀드는 별도 판매 검증 후보로 보존하며 현재 11개 상점 상품에는 포함하지 않는다.</w:t>
       </w:r>
     </w:p>
     <w:p>

</xml_diff>

<commit_message>
feat: virtualize server mailbox UI and document 0.19.0 validation
</commit_message>
<xml_diff>
--- a/AI/planning/beta-20260913/왕국군_키우기_기획서_개정_베타버전.docx
+++ b/AI/planning/beta-20260913/왕국군_키우기_기획서_개정_베타버전.docx
@@ -329,6 +329,44 @@
     <w:p>
       <w:r>
         <w:t>구현 전 검증은 초기화 전후 비교 확인창, 하나의 원자 저장, 저장 실패 시 전체 취소, 중복 실행 방지, 오프라인 안전 기준 초기화, 새 사이클 장비 보존, 최초 보상 중복 방지, 기존 환생 투자 이관을 포함한다. 계정별 실제 데이터 초기화는 승인된 정책이 정해진 뒤 진행한다.</w:t>
+      </w:r>
+    </w:p>
+    <w:p>
+      <w:pPr>
+        <w:pStyle w:val="Heading1"/>
+      </w:pPr>
+      <w:r>
+        <w:t>2026-10-31 개정: 우편함 서버 연동 (0.19.0)</w:t>
+      </w:r>
+    </w:p>
+    <w:p>
+      <w:r>
+        <w:t>우편함은 서버 목록 조회와 수령 API를 사용한다. 최대 100통을 열 때 50통씩 조회하여 메모리에 보관하고 닫을 때 비운다. 스크롤은 보이는 행과 여유 2행을 재사용하며 스크롤 중 서버 요청을 하지 않는다.</w:t>
+      </w:r>
+    </w:p>
+    <w:p>
+      <w:r>
+        <w:t>개별 수령과 모두 받기를 제공한다. 모두 받기는 선택 시점의 우편을 최대 50통씩 처리하며, 뒤 묶음 실패 시 앞서 성공한 지급은 유지한다. 서버 수령 성공 우편은 바로 목록에서 제거한다. 기존 프리팹과 삭제 버튼은 보존하고 삭제 버튼은 비활성화한다.</w:t>
+      </w:r>
+    </w:p>
+    <w:p>
+      <w:r>
+        <w:t>재화와 장비는 서버의 최종 상태를 반영한다. 획득 팝업에는 자동 분해·대기·예비 보관을 포함한 실제 처리 결과를 표시한다. 응답 유실 시 중복 수령 요청을 보내지 않고 서버 상태를 재조회한다.</w:t>
+      </w:r>
+    </w:p>
+    <w:p>
+      <w:r>
+        <w:t>출석은 서버 개편 전까지 준비 중으로 표시하고 자동 기록과 로컬 지급을 중지한다. 기존 기록·보상표·프리팹은 보존한다. 후속 개편은 월 단위 초기화, 출석 인정과 실제 수령 분리, 서버 전체 보상표, 대표 아이콘 +N, 수령 가능 일차 일괄 수령, 월말 미수령 권리의 우편 이월이다. 우편함이 가득 찼을 때의 이월 정책은 미정이다.</w:t>
+      </w:r>
+    </w:p>
+    <w:p>
+      <w:r>
+        <w:t>과거 로컬 우편을 서버에 자동 이관하거나 지급하지 않는다. 로컬 생성·지급·삭제 코드는 Editor의 격리 테스트 계정에서만 사용할 수 있다. 재접속 보상은 변경하지 않는다.</w:t>
+      </w:r>
+    </w:p>
+    <w:p>
+      <w:r>
+        <w:t>검증은 Unity 6000.3.21f1에서 가짜 서버 응답과 실제 프리팹을 사용한 검사, 실제 서버 통합 검사, Android 실기기 검사를 구분한다. 결과는 AI/validation/mailbox-server-20261031/README.md에 기록한다.</w:t>
       </w:r>
     </w:p>
     <w:sectPr>

</xml_diff>

<commit_message>
test: verify mailbox recovery and shared UI in 0.19.4
</commit_message>
<xml_diff>
--- a/AI/planning/beta-20260913/왕국군_키우기_기획서_개정_베타버전.docx
+++ b/AI/planning/beta-20260913/왕국군_키우기_기획서_개정_베타버전.docx
@@ -336,7 +336,7 @@
         <w:pStyle w:val="Heading1"/>
       </w:pPr>
       <w:r>
-        <w:t>2026-10-31 개정: 우편함 서버 연동 (0.19.0)</w:t>
+        <w:t xml:space="preserve">2026-11-01 개정: 우편함 서버 연동·구조 정리 (0.19.4)</w:t>
       </w:r>
     </w:p>
     <w:p>
@@ -346,7 +346,7 @@
     </w:p>
     <w:p>
       <w:r>
-        <w:t>개별 수령과 모두 받기를 제공한다. 모두 받기는 선택 시점의 우편을 최대 50통씩 처리하며, 뒤 묶음 실패 시 앞서 성공한 지급은 유지한다. 서버 수령 성공 우편은 바로 목록에서 제거한다. 기존 프리팹과 삭제 버튼은 보존하고 삭제 버튼은 비활성화한다.</w:t>
+        <w:t xml:space="preserve">개별 수령과 모두 받기를 제공한다. 모두 받기는 선택 시점의 우편을 최대 50통씩 처리하며, 뒤 묶음 실패 시 앞서 성공한 지급은 유지한다. 서버 수령 성공 우편은 바로 목록에서 제거한다. 기존 프리팹과 삭제 버튼은 보존하고 삭제 버튼은 비활성화한다. 우편 조회 실패는 창이 열린 동안 30초 후 다시 조회하며 수동 다시 불러오기도 제공한다. 응답 유실·검증 오류·저장 실패에는 수령 요청을 재전송하지 않고 플레이어 상태와 우편 목록을 재조회한다. 복구 실패 시 추가 수령을 막으며 확인된 성공분만 획득 팝업에 표시한다. 장비는 실제 보관 위치와 희귀도를 표시하고 자동 분해 결과는 실제 강화석 수량으로 표시한다.</w:t>
       </w:r>
     </w:p>
     <w:p>
@@ -356,7 +356,7 @@
     </w:p>
     <w:p>
       <w:r>
-        <w:t>출석은 서버 개편 전까지 준비 중으로 표시하고 자동 기록과 로컬 지급을 중지한다. 기존 기록·보상표·프리팹은 보존한다. 후속 개편은 월 단위 초기화, 출석 인정과 실제 수령 분리, 서버 전체 보상표, 대표 아이콘 +N, 수령 가능 일차 일괄 수령, 월말 미수령 권리의 우편 이월이다. 우편함이 가득 찼을 때의 이월 정책은 미정이다.</w:t>
+        <w:t xml:space="preserve">이번 0.19.4 개정은 우편함에 한정하며 현재 머지된 출석·광고·재접속 보상 정책과 서버 API는 변경하지 않는다. 공통 보상 슬롯·팝업은 재사용하고 출석 이월 알림은 우편함 갱신에 연결한다.</w:t>
       </w:r>
     </w:p>
     <w:p>

</xml_diff>